<commit_message>
Finalize iFood project instructions, rubric, and examples
</commit_message>
<xml_diff>
--- a/Executive Summary Example.docx
+++ b/Executive Summary Example.docx
@@ -8,14 +8,6 @@
       </w:pPr>
       <w:r>
         <w:t>Executive summary example</w:t>
-      </w:r>
-    </w:p>
-    <w:p>
-      <w:pPr>
-        <w:pStyle w:val="Subtitle"/>
-      </w:pPr>
-      <w:r>
-        <w:t>Customer inactivity and churn risk</w:t>
       </w:r>
     </w:p>
     <w:p>

</xml_diff>